<commit_message>
Update AI prompt log
</commit_message>
<xml_diff>
--- a/Project_AI_Prompt_Log.docx
+++ b/Project_AI_Prompt_Log.docx
@@ -2105,6 +2105,139 @@
                 <w:szCs w:val="19"/>
               </w:rPr>
               <w:t xml:space="preserve">Context: I asked whether the five dropped counties truly had no data. Claude found that VA and CA have no NDCP prices in 2021, and that the Oshkosh and La Crosse gaps are BLS-suppressed wages. It noted that NDCP fills missing survey years by linear interpolation. Changes: removed metro-clustered SEs from both scripts (HC1 only); removed the 8-year rule; pre_analysis.py now saves the full metro panel before missing-data drops. final_analysis.py fills interior gaps of ≤ 2 years that have observed values on both sides with a straight line, applied to all counties (163 prices, 26 wages; +184 county-years, mostly VA, NC and CA in 2021). 2022 is never filled, and all fills are flagged. Claude checked that the observed rows reproduce the analysis dataset exactly. Top 10 returns to Arlington, Stearns, San Francisco, Winnebago, Alexandria, Belmont, Jefferson, La Crosse, Norfolk and Cumberland. Stability 2019 vs 2022 (983 counties): r = 0.78, slope 0.89.</w:t>
+            </w:r>
+          </w:p>
+        </w:tc>
+      </w:tr>
+      <w:tr>
+        <w:trPr>
+          <w:tblHeader w:val="false"/>
+        </w:trPr>
+        <w:tc>
+          <w:tcPr>
+            <w:tcW w:type="dxa" w:w="500"/>
+            <w:tcBorders>
+              <w:top w:val="single" w:color="999999" w:sz="4"/>
+              <w:left w:val="single" w:color="999999" w:sz="4"/>
+              <w:bottom w:val="single" w:color="999999" w:sz="4"/>
+              <w:right w:val="single" w:color="999999" w:sz="4"/>
+            </w:tcBorders>
+            <w:tcMar>
+              <w:top w:type="dxa" w:w="80"/>
+              <w:left w:type="dxa" w:w="100"/>
+              <w:bottom w:type="dxa" w:w="80"/>
+              <w:right w:type="dxa" w:w="100"/>
+            </w:tcMar>
+          </w:tcPr>
+          <w:p>
+            <w:pPr>
+              <w:spacing w:after="60"/>
+            </w:pPr>
+            <w:r>
+              <w:rPr>
+                <w:rFonts w:ascii="Calibri" w:cs="Calibri" w:eastAsia="Calibri" w:hAnsi="Calibri"/>
+                <w:b w:val="false"/>
+                <w:bCs w:val="false"/>
+                <w:sz w:val="19"/>
+                <w:szCs w:val="19"/>
+              </w:rPr>
+              <w:t xml:space="preserve">10</w:t>
+            </w:r>
+          </w:p>
+        </w:tc>
+        <w:tc>
+          <w:tcPr>
+            <w:tcW w:type="dxa" w:w="1500"/>
+            <w:tcBorders>
+              <w:top w:val="single" w:color="999999" w:sz="4"/>
+              <w:left w:val="single" w:color="999999" w:sz="4"/>
+              <w:bottom w:val="single" w:color="999999" w:sz="4"/>
+              <w:right w:val="single" w:color="999999" w:sz="4"/>
+            </w:tcBorders>
+            <w:tcMar>
+              <w:top w:type="dxa" w:w="80"/>
+              <w:left w:type="dxa" w:w="100"/>
+              <w:bottom w:type="dxa" w:w="80"/>
+              <w:right w:type="dxa" w:w="100"/>
+            </w:tcMar>
+          </w:tcPr>
+          <w:p>
+            <w:pPr>
+              <w:spacing w:after="60"/>
+            </w:pPr>
+            <w:r>
+              <w:rPr>
+                <w:rFonts w:ascii="Calibri" w:cs="Calibri" w:eastAsia="Calibri" w:hAnsi="Calibri"/>
+                <w:b w:val="false"/>
+                <w:bCs w:val="false"/>
+                <w:sz w:val="19"/>
+                <w:szCs w:val="19"/>
+              </w:rPr>
+              <w:t xml:space="preserve">Oct 10, 2026 – Claude (Cowork)</w:t>
+            </w:r>
+          </w:p>
+        </w:tc>
+        <w:tc>
+          <w:tcPr>
+            <w:tcW w:type="dxa" w:w="4200"/>
+            <w:tcBorders>
+              <w:top w:val="single" w:color="999999" w:sz="4"/>
+              <w:left w:val="single" w:color="999999" w:sz="4"/>
+              <w:bottom w:val="single" w:color="999999" w:sz="4"/>
+              <w:right w:val="single" w:color="999999" w:sz="4"/>
+            </w:tcBorders>
+            <w:tcMar>
+              <w:top w:type="dxa" w:w="80"/>
+              <w:left w:type="dxa" w:w="100"/>
+              <w:bottom w:type="dxa" w:w="80"/>
+              <w:right w:type="dxa" w:w="100"/>
+            </w:tcMar>
+          </w:tcPr>
+          <w:p>
+            <w:pPr>
+              <w:spacing w:after="60"/>
+            </w:pPr>
+            <w:r>
+              <w:rPr>
+                <w:rFonts w:ascii="Calibri" w:cs="Calibri" w:eastAsia="Calibri" w:hAnsi="Calibri"/>
+                <w:b w:val="false"/>
+                <w:bCs w:val="false"/>
+                <w:sz w:val="19"/>
+                <w:szCs w:val="19"/>
+              </w:rPr>
+              <w:t xml:space="preserve">Can you see what the homework PDF ultimately entails and create the GIT repo and start uploading stuff? also please upload the output folder so my teammates can refer to the data</w:t>
+            </w:r>
+          </w:p>
+        </w:tc>
+        <w:tc>
+          <w:tcPr>
+            <w:tcW w:type="dxa" w:w="3160"/>
+            <w:tcBorders>
+              <w:top w:val="single" w:color="999999" w:sz="4"/>
+              <w:left w:val="single" w:color="999999" w:sz="4"/>
+              <w:bottom w:val="single" w:color="999999" w:sz="4"/>
+              <w:right w:val="single" w:color="999999" w:sz="4"/>
+            </w:tcBorders>
+            <w:tcMar>
+              <w:top w:type="dxa" w:w="80"/>
+              <w:left w:type="dxa" w:w="100"/>
+              <w:bottom w:type="dxa" w:w="80"/>
+              <w:right w:type="dxa" w:w="100"/>
+            </w:tcMar>
+          </w:tcPr>
+          <w:p>
+            <w:pPr>
+              <w:spacing w:after="60"/>
+            </w:pPr>
+            <w:r>
+              <w:rPr>
+                <w:rFonts w:ascii="Calibri" w:cs="Calibri" w:eastAsia="Calibri" w:hAnsi="Calibri"/>
+                <w:b w:val="false"/>
+                <w:bCs w:val="false"/>
+                <w:sz w:val="19"/>
+                <w:szCs w:val="19"/>
+              </w:rPr>
+              <w:t xml:space="preserve">Claude summarized the remaining deliverables from the assignment PDF: Pre-Analysis answers, ≤ 6 slides (parts a–e), an appendix on data handling, and a code repo or prompt history. It created a local git repo in the project folder with a README (deliverables checklist, results, layout, reproduction steps, data links) and a .gitignore that excludes the large raw downloads (NDCP xlsx, OEWS zips) and PDFs. It replaced the hardcoded Census API key in build_acs_county.py with an environment variable before committing. Initial commit includes code, PS5 extracts, data/processed and output/. Claude's sandbox cannot reach github.com, so the push to a private GitHub repo is done by me.</w:t>
             </w:r>
           </w:p>
         </w:tc>

</xml_diff>